<commit_message>
docs: update operator handbook workflows
</commit_message>
<xml_diff>
--- a/docs/GLV_System_Documentation.docx
+++ b/docs/GLV_System_Documentation.docx
@@ -157,7 +157,7 @@
               <w:pStyle w:val="TableText"/>
             </w:pPr>
             <w:r>
-              <w:t xml:space="preserve">July 05, 2026</w:t>
+              <w:t xml:space="preserve">July 28, 2026</w:t>
             </w:r>
           </w:p>
         </w:tc>
@@ -3164,7 +3164,7 @@
               <w:pStyle w:val="TableText"/>
             </w:pPr>
             <w:r>
-              <w:t xml:space="preserve">Product account creation, status, balance, delivery status, payment entry, corrections, and lifecycle handling.</w:t>
+              <w:t xml:space="preserve">Product account creation, automatic terms, status, balance, delivery, corrections, lifecycle-gated cancellation/reactivation documents, and payment entry.</w:t>
             </w:r>
           </w:p>
         </w:tc>
@@ -3226,7 +3226,7 @@
               <w:pStyle w:val="TableText"/>
             </w:pPr>
             <w:r>
-              <w:t xml:space="preserve">Payment recording, receipt numbers, grouped history, deletion/recalculation, and staff-safe filtering.</w:t>
+              <w:t xml:space="preserve">Payment recording, receipt numbers, customer receipt communication, grouped history, deletion/recalculation, and staff-safe filtering.</w:t>
             </w:r>
           </w:p>
         </w:tc>
@@ -3702,7 +3702,7 @@
               <w:pStyle w:val="TableText"/>
             </w:pPr>
             <w:r>
-              <w:t xml:space="preserve">/settings</w:t>
+              <w:t xml:space="preserve">/settings, /settings/legal</w:t>
             </w:r>
           </w:p>
         </w:tc>
@@ -3722,7 +3722,7 @@
               <w:pStyle w:val="TableText"/>
             </w:pPr>
             <w:r>
-              <w:t xml:space="preserve">Admin control panel for company, layaway, payroll, security, notifications, theme, and system metadata.</w:t>
+              <w:t xml:space="preserve">Admin control panel for company, layaway, payroll, security, legal templates, addressed terms, customer communications, theme, and system metadata.</w:t>
             </w:r>
           </w:p>
         </w:tc>
@@ -4213,6 +4213,68 @@
               <w:pStyle w:val="TableText"/>
             </w:pPr>
             <w:r>
+              <w:t xml:space="preserve">Automatic terms</w:t>
+            </w:r>
+          </w:p>
+        </w:tc>
+        <w:tc>
+          <w:tcPr>
+            <w:tcW w:w="3100" w:type="dxa"/>
+            <w:vAlign w:val="top"/>
+            <w:tcMar>
+              <w:top w:w="80" w:type="dxa"/>
+              <w:left w:w="120" w:type="dxa"/>
+              <w:bottom w:w="80" w:type="dxa"/>
+              <w:right w:w="120" w:type="dxa"/>
+            </w:tcMar>
+          </w:tcPr>
+          <w:p>
+            <w:pPr>
+              <w:pStyle w:val="TableText"/>
+            </w:pPr>
+            <w:r>
+              <w:t xml:space="preserve">lib/customer-documents.ts, lib/customer-communications.ts</w:t>
+            </w:r>
+          </w:p>
+        </w:tc>
+        <w:tc>
+          <w:tcPr>
+            <w:tcW w:w="4060" w:type="dxa"/>
+            <w:vAlign w:val="top"/>
+            <w:tcMar>
+              <w:top w:w="80" w:type="dxa"/>
+              <w:left w:w="120" w:type="dxa"/>
+              <w:bottom w:w="80" w:type="dxa"/>
+              <w:right w:w="120" w:type="dxa"/>
+            </w:tcMar>
+          </w:tcPr>
+          <w:p>
+            <w:pPr>
+              <w:pStyle w:val="TableText"/>
+            </w:pPr>
+            <w:r>
+              <w:t xml:space="preserve">Creates addressed terms after account creation and queues one customer channel when contact details exist.</w:t>
+            </w:r>
+          </w:p>
+        </w:tc>
+      </w:tr>
+      <w:tr>
+        <w:tc>
+          <w:tcPr>
+            <w:tcW w:w="2200" w:type="dxa"/>
+            <w:vAlign w:val="top"/>
+            <w:tcMar>
+              <w:top w:w="80" w:type="dxa"/>
+              <w:left w:w="120" w:type="dxa"/>
+              <w:bottom w:w="80" w:type="dxa"/>
+              <w:right w:w="120" w:type="dxa"/>
+            </w:tcMar>
+          </w:tcPr>
+          <w:p>
+            <w:pPr>
+              <w:pStyle w:val="TableText"/>
+            </w:pPr>
+            <w:r>
               <w:t xml:space="preserve">Record payment</w:t>
             </w:r>
           </w:p>
@@ -4253,7 +4315,7 @@
               <w:pStyle w:val="TableText"/>
             </w:pPr>
             <w:r>
-              <w:t xml:space="preserve">Rejects closed/suspended/cancelled/completed accounts, generates receipt, updates balance/status, creates overpayment credit.</w:t>
+              <w:t xml:space="preserve">Rejects closed/suspended/cancelled/completed accounts, generates receipt, updates balance/status, creates overpayment credit, and queues one receipt channel.</w:t>
             </w:r>
           </w:p>
         </w:tc>
@@ -5945,7 +6007,7 @@
         <w:keepNext/>
       </w:pPr>
       <w:r>
-        <w:t xml:space="preserve">11. Notifications and AI Support</w:t>
+        <w:t xml:space="preserve">11. Notifications, Customer Communications, and AI Support</w:t>
       </w:r>
     </w:p>
     <w:p>
@@ -5953,7 +6015,7 @@
         <w:pStyle w:val="Normal"/>
       </w:pPr>
       <w:r>
-        <w:t xml:space="preserve">Notifications are currently computed attention items, not persisted notification records. The live route checks procurement readiness for users with product-management access. The sidebar badge opens the relevant target and clears that exact notification locally; if the count or label changes later, it can show again.</w:t>
+        <w:t xml:space="preserve">The system has computed in-app attention items for operators and persisted outbound customer messages. Customer documents and receipts queue exactly one enabled channel. Legal/document messages prefer email, then WhatsApp, then SMS; payment receipts prefer WhatsApp, then SMS, then email. With no email or phone, no outbound row is queued and staff use the in-system receipt/tracking record. Delivery preserves the selected channel and retries provider failures.</w:t>
       </w:r>
     </w:p>
     <w:tbl>
@@ -6278,6 +6340,90 @@
             </w:pPr>
             <w:r>
               <w:t xml:space="preserve">Navigation, permissions, payments, accounts, products, procurement, staff, reports, settings, and troubleshooting.</w:t>
+            </w:r>
+          </w:p>
+        </w:tc>
+      </w:tr>
+      <w:tr>
+        <w:tc>
+          <w:tcPr>
+            <w:tcW w:w="2300" w:type="dxa"/>
+            <w:vAlign w:val="top"/>
+            <w:tcMar>
+              <w:top w:w="80" w:type="dxa"/>
+              <w:left w:w="120" w:type="dxa"/>
+              <w:bottom w:w="80" w:type="dxa"/>
+              <w:right w:w="120" w:type="dxa"/>
+            </w:tcMar>
+          </w:tcPr>
+          <w:p>
+            <w:pPr>
+              <w:pStyle w:val="TableText"/>
+            </w:pPr>
+            <w:r>
+              <w:t xml:space="preserve">Customer message queue</w:t>
+            </w:r>
+          </w:p>
+        </w:tc>
+        <w:tc>
+          <w:tcPr>
+            <w:tcW w:w="7060" w:type="dxa"/>
+            <w:vAlign w:val="top"/>
+            <w:tcMar>
+              <w:top w:w="80" w:type="dxa"/>
+              <w:left w:w="120" w:type="dxa"/>
+              <w:bottom w:w="80" w:type="dxa"/>
+              <w:right w:w="120" w:type="dxa"/>
+            </w:tcMar>
+          </w:tcPr>
+          <w:p>
+            <w:pPr>
+              <w:pStyle w:val="TableText"/>
+            </w:pPr>
+            <w:r>
+              <w:t xml:space="preserve">CustomerMessage records are created by lib/customer-communications.ts and dispatched by the notifications route or daily cron.</w:t>
+            </w:r>
+          </w:p>
+        </w:tc>
+      </w:tr>
+      <w:tr>
+        <w:tc>
+          <w:tcPr>
+            <w:tcW w:w="2300" w:type="dxa"/>
+            <w:vAlign w:val="top"/>
+            <w:tcMar>
+              <w:top w:w="80" w:type="dxa"/>
+              <w:left w:w="120" w:type="dxa"/>
+              <w:bottom w:w="80" w:type="dxa"/>
+              <w:right w:w="120" w:type="dxa"/>
+            </w:tcMar>
+          </w:tcPr>
+          <w:p>
+            <w:pPr>
+              <w:pStyle w:val="TableText"/>
+            </w:pPr>
+            <w:r>
+              <w:t xml:space="preserve">No-contact handling</w:t>
+            </w:r>
+          </w:p>
+        </w:tc>
+        <w:tc>
+          <w:tcPr>
+            <w:tcW w:w="7060" w:type="dxa"/>
+            <w:vAlign w:val="top"/>
+            <w:tcMar>
+              <w:top w:w="80" w:type="dxa"/>
+              <w:left w:w="120" w:type="dxa"/>
+              <w:bottom w:w="80" w:type="dxa"/>
+              <w:right w:w="120" w:type="dxa"/>
+            </w:tcMar>
+          </w:tcPr>
+          <w:p>
+            <w:pPr>
+              <w:pStyle w:val="TableText"/>
+            </w:pPr>
+            <w:r>
+              <w:t xml:space="preserve">No message is queued; staff explain terms verbally and show the receipt/product tracking information.</w:t>
             </w:r>
           </w:p>
         </w:tc>
@@ -6790,6 +6936,68 @@
               <w:pStyle w:val="TableText"/>
             </w:pPr>
             <w:r>
+              <w:t xml:space="preserve">Legal documents</w:t>
+            </w:r>
+          </w:p>
+        </w:tc>
+        <w:tc>
+          <w:tcPr>
+            <w:tcW w:w="3000" w:type="dxa"/>
+            <w:vAlign w:val="top"/>
+            <w:tcMar>
+              <w:top w:w="80" w:type="dxa"/>
+              <w:left w:w="120" w:type="dxa"/>
+              <w:bottom w:w="80" w:type="dxa"/>
+              <w:right w:w="120" w:type="dxa"/>
+            </w:tcMar>
+          </w:tcPr>
+          <w:p>
+            <w:pPr>
+              <w:pStyle w:val="TableText"/>
+            </w:pPr>
+            <w:r>
+              <w:t xml:space="preserve">editable terms/cancellation/reactivation/receipt templates</w:t>
+            </w:r>
+          </w:p>
+        </w:tc>
+        <w:tc>
+          <w:tcPr>
+            <w:tcW w:w="4460" w:type="dxa"/>
+            <w:vAlign w:val="top"/>
+            <w:tcMar>
+              <w:top w:w="80" w:type="dxa"/>
+              <w:left w:w="120" w:type="dxa"/>
+              <w:bottom w:w="80" w:type="dxa"/>
+              <w:right w:w="120" w:type="dxa"/>
+            </w:tcMar>
+          </w:tcPr>
+          <w:p>
+            <w:pPr>
+              <w:pStyle w:val="TableText"/>
+            </w:pPr>
+            <w:r>
+              <w:t xml:space="preserve">Terms are generated for new accounts and managed in Settings; lifecycle calculations are account-stage gated.</w:t>
+            </w:r>
+          </w:p>
+        </w:tc>
+      </w:tr>
+      <w:tr>
+        <w:tc>
+          <w:tcPr>
+            <w:tcW w:w="1900" w:type="dxa"/>
+            <w:vAlign w:val="top"/>
+            <w:tcMar>
+              <w:top w:w="80" w:type="dxa"/>
+              <w:left w:w="120" w:type="dxa"/>
+              <w:bottom w:w="80" w:type="dxa"/>
+              <w:right w:w="120" w:type="dxa"/>
+            </w:tcMar>
+          </w:tcPr>
+          <w:p>
+            <w:pPr>
+              <w:pStyle w:val="TableText"/>
+            </w:pPr>
+            <w:r>
               <w:t xml:space="preserve">Notifications</w:t>
             </w:r>
           </w:p>
@@ -6830,7 +7038,7 @@
               <w:pStyle w:val="TableText"/>
             </w:pPr>
             <w:r>
-              <w:t xml:space="preserve">Stored; current live notification route is procurement attention.</w:t>
+              <w:t xml:space="preserve">Controls the live one-channel customer queue. Provider credentials are required for delivery.</w:t>
             </w:r>
           </w:p>
         </w:tc>
@@ -7597,7 +7805,7 @@
               <w:pStyle w:val="TableText"/>
             </w:pPr>
             <w:r>
-              <w:t xml:space="preserve">Can fail when Neon is unreachable before code build starts.</w:t>
+              <w:t xml:space="preserve">Use the Supabase session pooler for migrations; the transaction pooler can stall migration deploy.</w:t>
             </w:r>
           </w:p>
         </w:tc>
@@ -8067,7 +8275,7 @@
               <w:pStyle w:val="TableText"/>
             </w:pPr>
             <w:r>
-              <w:t xml:space="preserve">Full build and migration deploy require Neon connectivity.</w:t>
+              <w:t xml:space="preserve">Full build and migration deploy require Supabase connectivity through the correct pooler.</w:t>
             </w:r>
           </w:p>
         </w:tc>

</xml_diff>

<commit_message>
fix: deploy database migrations before Vercel builds
</commit_message>
<xml_diff>
--- a/docs/GLV_System_Documentation.docx
+++ b/docs/GLV_System_Documentation.docx
@@ -7785,7 +7785,7 @@
               <w:pStyle w:val="TableText"/>
             </w:pPr>
             <w:r>
-              <w:t xml:space="preserve">Runs prisma migrate deploy, prisma generate, next build.</w:t>
+              <w:t xml:space="preserve">Runs prisma generate and next build.</w:t>
             </w:r>
           </w:p>
         </w:tc>
@@ -7805,7 +7805,7 @@
               <w:pStyle w:val="TableText"/>
             </w:pPr>
             <w:r>
-              <w:t xml:space="preserve">Use the Supabase session pooler for migrations; the transaction pooler can stall migration deploy.</w:t>
+              <w:t xml:space="preserve">Does not deploy migrations.</w:t>
             </w:r>
           </w:p>
         </w:tc>
@@ -7847,7 +7847,7 @@
               <w:pStyle w:val="TableText"/>
             </w:pPr>
             <w:r>
-              <w:t xml:space="preserve">Deploy migrations to database.</w:t>
+              <w:t xml:space="preserve">Deploy migrations explicitly before a dependent release.</w:t>
             </w:r>
           </w:p>
         </w:tc>
@@ -7867,7 +7867,7 @@
               <w:pStyle w:val="TableText"/>
             </w:pPr>
             <w:r>
-              <w:t xml:space="preserve">Requires reachable DATABASE_URL.</w:t>
+              <w:t xml:space="preserve">Use DATABASE_URL_UNPOOLED from a trusted operator environment; do not use the port 6543 transaction pooler.</w:t>
             </w:r>
           </w:p>
         </w:tc>

</xml_diff>

<commit_message>
feat: make GLV SMS messages configurable
</commit_message>
<xml_diff>
--- a/docs/GLV_System_Documentation.docx
+++ b/docs/GLV_System_Documentation.docx
@@ -8346,6 +8346,14 @@
       </w:pPr>
       <w:r>
         <w:t xml:space="preserve">BMS Africa provides SMS using the mNotify Quick Bulk SMS API. Configure MNOTIFY_API_KEY, MNOTIFY_SENDER_ID (approved GLV sender GODS LOVE V), and CRON_SECRET server-side. Apply the SmsNotification migration before enabling SMS Notifications in Settings. Never expose the API key or log request URLs containing it.</w:t>
+      </w:r>
+    </w:p>
+    <w:p>
+      <w:pPr>
+        <w:pStyle w:val="Normal"/>
+      </w:pPr>
+      <w:r>
+        <w:t xml:space="preserve">Super administrators configure four database-backed message templates on Settings &gt; SMS: Salary payment, Customer welcome, 70% progress, and Missed payment. The page lists the placeholders permitted for each event, renders a sample preview, validates a 612-character maximum, and can restore all defaults. Saved templates apply to newly queued messages; existing queue rows keep their original message snapshot. Salary resolves to the staff member on the salary payment. Customer templates resolve to the customer attached to the qualifying account. Invalid or missing phone numbers fail visibly and are never sent to a fallback recipient.</w:t>
       </w:r>
     </w:p>
     <w:p>

</xml_diff>

<commit_message>
feat: brand SMS messages and use first names
</commit_message>
<xml_diff>
--- a/docs/GLV_System_Documentation.docx
+++ b/docs/GLV_System_Documentation.docx
@@ -8354,6 +8354,14 @@
       </w:pPr>
       <w:r>
         <w:t xml:space="preserve">Super administrators configure four database-backed message templates on Settings &gt; SMS: Salary payment, Customer welcome, 70% progress, and Missed payment. The page lists the placeholders permitted for each event, renders a sample preview, validates a 612-character maximum, and can restore all defaults. Saved templates apply to newly queued messages; existing queue rows keep their original message snapshot. Salary resolves to the staff member on the salary payment. Customer templates resolve to the customer attached to the qualifying account. Invalid or missing phone numbers fail visibly and are never sent to a fallback recipient.</w:t>
+      </w:r>
+    </w:p>
+    <w:p>
+      <w:pPr>
+        <w:pStyle w:val="Normal"/>
+      </w:pPr>
+      <w:r>
+        <w:t xml:space="preserve">Default message text is branded Rock Frost Group, while every staff/customer name placeholder renders only the first whitespace-delimited name. The BMS handset sender is Rock Frost, which fits the provider's 11-character limit and must be approved in the BMS account before production configuration.</w:t>
       </w:r>
     </w:p>
     <w:p>

</xml_diff>

<commit_message>
feat: send weekly payment summary SMS
</commit_message>
<xml_diff>
--- a/docs/GLV_System_Documentation.docx
+++ b/docs/GLV_System_Documentation.docx
@@ -8353,7 +8353,7 @@
         <w:pStyle w:val="Normal"/>
       </w:pPr>
       <w:r>
-        <w:t xml:space="preserve">Super administrators configure four database-backed message templates on Settings &gt; SMS: Salary payment, Customer welcome, 70% progress, and Missed payment. The page lists the placeholders permitted for each event, renders a sample preview, validates a 612-character maximum, and can restore all defaults. Saved templates apply to newly queued messages; existing queue rows keep their original message snapshot. Salary resolves to the staff member on the salary payment. Customer templates resolve to the customer attached to the qualifying account. Invalid or missing phone numbers fail visibly and are never sent to a fallback recipient.</w:t>
+        <w:t xml:space="preserve">Super administrators configure five database-backed message templates on Settings &gt; SMS: Salary payment, Customer welcome, 70% progress, Missed payment, and Weekly payment summary. The page lists the placeholders permitted for each event, renders a sample preview, validates a 612-character maximum, and can restore all defaults. Saved templates apply to newly queued messages; existing queue rows keep their original message snapshot. Salary resolves to the staff member on the salary payment. Customer templates resolve to the qualifying customer. Invalid or missing phone numbers fail visibly and are never sent to a fallback recipient.</w:t>
       </w:r>
     </w:p>
     <w:p>
@@ -8377,6 +8377,14 @@
         <w:pStyle w:val="Normal"/>
       </w:pPr>
       <w:r>
+        <w:t xml:space="preserve">Recording a staff deposit triggers the weekly customer summary. For that staff member, GLV totals each customer's Payment records from Monday through Sunday across all product accounts and queues one summary only for customers whose total is greater than zero. The dedupe key combines staff, customer and week. Another deposit cannot duplicate an accepted message, but it can refresh a summary that is still Pending or Failed. Customers never receive another staff member's totals.</w:t>
+      </w:r>
+    </w:p>
+    <w:p>
+      <w:pPr>
+        <w:pStyle w:val="Normal"/>
+      </w:pPr>
+      <w:r>
         <w:t xml:space="preserve">Active and overdue accounts with a positive balance qualify for reminders after seven full days without payment, and at most once per unpaid week thereafter. The later of account start, latest payment date and latest payment entry time anchors the interval. Backdated entries restart it. Other lifecycle statuses are excluded. The protected /api/cron/sms-notifications job runs at 09:00 UTC daily, queues reminders and dispatches up to 100 messages in groups of five. Authenticated activity and qualifying mutations also dispatch pending messages. Monitor backlog and schedule more frequent runs if volume requires it.</w:t>
       </w:r>
     </w:p>
@@ -8385,7 +8393,7 @@
         <w:pStyle w:val="Normal"/>
       </w:pPr>
       <w:r>
-        <w:t xml:space="preserve">The dedicated /settings/sms page lets super administrators enable or pause automatic SMS, verify provider/API/sender configuration, review the four notification rules, inspect the latest 100 queue records, and retry definitive failures. The queue records unique event keys within the business transaction. Conditional claims prevent concurrent workers sending the same item. Before dispatch, source existence, account eligibility and current phone are checked. Correct missing phones or provider errors before Retry. Provider acceptance is labelled ACCEPTED, not confirmed handset delivery. Check BMS campaign history using the saved campaign ID. Rate limits retry after one hour, up to five attempts. Timeouts and interrupted workers become UNKNOWN and require reconciliation rather than blind resending. Restored pending or processing messages become UNKNOWN. Disabling SMS pauses the queue.</w:t>
+        <w:t xml:space="preserve">The dedicated /settings/sms page lets super administrators enable or pause automatic SMS, verify provider/API/sender configuration, review the five notification rules, inspect the latest 100 queue records, and retry definitive failures. The queue records unique event keys within the business transaction. Conditional claims prevent concurrent workers sending the same item. Before dispatch, source existence, account eligibility and current phone are checked. Correct missing phones or provider errors before Retry. Provider acceptance is labelled ACCEPTED, not confirmed handset delivery. Check BMS campaign history using the saved campaign ID. Rate limits retry after one hour, up to five attempts. Timeouts and interrupted workers become UNKNOWN and require reconciliation rather than blind resending. Restored pending or processing messages become UNKNOWN. Disabling SMS pauses the queue.</w:t>
       </w:r>
     </w:p>
     <w:p>

</xml_diff>

<commit_message>
feat: integrate GLV business management
</commit_message>
<xml_diff>
--- a/docs/GLV_System_Documentation.docx
+++ b/docs/GLV_System_Documentation.docx
@@ -8402,6 +8402,276 @@
       </w:pPr>
       <w:r>
         <w:t xml:space="preserve">Implementation checks use mocked provider/database tests in scripts/sms.test.ts, TypeScript, lint and a build without migration deployment. Production migration, credentials, authenticated UI and real delivery must be verified separately before activation is considered complete.</w:t>
+      </w:r>
+    </w:p>
+    <w:p>
+      <w:pPr>
+        <w:pStyle w:val="Heading1"/>
+        <w:keepNext/>
+      </w:pPr>
+      <w:r>
+        <w:t xml:space="preserve">17. Integrated Business Management</w:t>
+      </w:r>
+    </w:p>
+    <w:p>
+      <w:pPr>
+        <w:pStyle w:val="Normal"/>
+      </w:pPr>
+      <w:r>
+        <w:t xml:space="preserve">The administrator-only /business workspace presents People, Payroll, Accounting and Analytics as four connected sections of one GLV workflow. It uses the existing Staff, Payment and StaffSalaryPayment records and adds leave requests, performance reviews and operating expenses. No module activation or duplicate employee setup is required.</w:t>
+      </w:r>
+    </w:p>
+    <w:tbl>
+      <w:tblPr>
+        <w:tblStyle w:val="TableGrid"/>
+        <w:tblW w:w="9360" w:type="dxa"/>
+        <w:tblInd w:w="120" w:type="dxa"/>
+        <w:tblBorders>
+          <w:top w:val="single" w:sz="4" w:color="DCE5DF"/>
+          <w:left w:val="single" w:sz="4" w:color="DCE5DF"/>
+          <w:bottom w:val="single" w:sz="4" w:color="DCE5DF"/>
+          <w:right w:val="single" w:sz="4" w:color="DCE5DF"/>
+          <w:insideH w:val="single" w:sz="4" w:color="DCE5DF"/>
+          <w:insideV w:val="single" w:sz="4" w:color="DCE5DF"/>
+        </w:tblBorders>
+      </w:tblPr>
+      <w:tblGrid>
+        <w:gridCol w:w="1900"/>
+        <w:gridCol w:w="7460"/>
+      </w:tblGrid>
+      <w:tr>
+        <w:tc>
+          <w:tcPr>
+            <w:tcW w:w="1900" w:type="dxa"/>
+            <w:vAlign w:val="top"/>
+            <w:shd w:fill="E8EEF5"/>
+            <w:tcMar>
+              <w:top w:w="80" w:type="dxa"/>
+              <w:left w:w="120" w:type="dxa"/>
+              <w:bottom w:w="80" w:type="dxa"/>
+              <w:right w:w="120" w:type="dxa"/>
+            </w:tcMar>
+          </w:tcPr>
+          <w:p>
+            <w:pPr>
+              <w:pStyle w:val="TableHeader"/>
+            </w:pPr>
+            <w:r>
+              <w:rPr>
+                <w:b/>
+              </w:rPr>
+              <w:t xml:space="preserve">Section</w:t>
+            </w:r>
+          </w:p>
+        </w:tc>
+        <w:tc>
+          <w:tcPr>
+            <w:tcW w:w="7460" w:type="dxa"/>
+            <w:vAlign w:val="top"/>
+            <w:shd w:fill="E8EEF5"/>
+            <w:tcMar>
+              <w:top w:w="80" w:type="dxa"/>
+              <w:left w:w="120" w:type="dxa"/>
+              <w:bottom w:w="80" w:type="dxa"/>
+              <w:right w:w="120" w:type="dxa"/>
+            </w:tcMar>
+          </w:tcPr>
+          <w:p>
+            <w:pPr>
+              <w:pStyle w:val="TableHeader"/>
+            </w:pPr>
+            <w:r>
+              <w:rPr>
+                <w:b/>
+              </w:rPr>
+              <w:t xml:space="preserve">Shared records and behavior</w:t>
+            </w:r>
+          </w:p>
+        </w:tc>
+      </w:tr>
+      <w:tr>
+        <w:tc>
+          <w:tcPr>
+            <w:tcW w:w="1900" w:type="dxa"/>
+            <w:vAlign w:val="top"/>
+            <w:tcMar>
+              <w:top w:w="80" w:type="dxa"/>
+              <w:left w:w="120" w:type="dxa"/>
+              <w:bottom w:w="80" w:type="dxa"/>
+              <w:right w:w="120" w:type="dxa"/>
+            </w:tcMar>
+          </w:tcPr>
+          <w:p>
+            <w:pPr>
+              <w:pStyle w:val="TableText"/>
+            </w:pPr>
+            <w:r>
+              <w:t xml:space="preserve">People</w:t>
+            </w:r>
+          </w:p>
+        </w:tc>
+        <w:tc>
+          <w:tcPr>
+            <w:tcW w:w="7460" w:type="dxa"/>
+            <w:vAlign w:val="top"/>
+            <w:tcMar>
+              <w:top w:w="80" w:type="dxa"/>
+              <w:left w:w="120" w:type="dxa"/>
+              <w:bottom w:w="80" w:type="dxa"/>
+              <w:right w:w="120" w:type="dxa"/>
+            </w:tcMar>
+          </w:tcPr>
+          <w:p>
+            <w:pPr>
+              <w:pStyle w:val="TableText"/>
+            </w:pPr>
+            <w:r>
+              <w:t xml:space="preserve">Existing staff directory plus leave requests, approve or reject decisions, and dated performance reviews scored 1 to 5.</w:t>
+            </w:r>
+          </w:p>
+        </w:tc>
+      </w:tr>
+      <w:tr>
+        <w:tc>
+          <w:tcPr>
+            <w:tcW w:w="1900" w:type="dxa"/>
+            <w:vAlign w:val="top"/>
+            <w:tcMar>
+              <w:top w:w="80" w:type="dxa"/>
+              <w:left w:w="120" w:type="dxa"/>
+              <w:bottom w:w="80" w:type="dxa"/>
+              <w:right w:w="120" w:type="dxa"/>
+            </w:tcMar>
+          </w:tcPr>
+          <w:p>
+            <w:pPr>
+              <w:pStyle w:val="TableText"/>
+            </w:pPr>
+            <w:r>
+              <w:t xml:space="preserve">Payroll</w:t>
+            </w:r>
+          </w:p>
+        </w:tc>
+        <w:tc>
+          <w:tcPr>
+            <w:tcW w:w="7460" w:type="dxa"/>
+            <w:vAlign w:val="top"/>
+            <w:tcMar>
+              <w:top w:w="80" w:type="dxa"/>
+              <w:left w:w="120" w:type="dxa"/>
+              <w:bottom w:w="80" w:type="dxa"/>
+              <w:right w:w="120" w:type="dxa"/>
+            </w:tcMar>
+          </w:tcPr>
+          <w:p>
+            <w:pPr>
+              <w:pStyle w:val="TableText"/>
+            </w:pPr>
+            <w:r>
+              <w:t xml:space="preserve">Existing monthly salary and salary payment history. Recording payment retains validation, audit logging and the staff-only salary SMS.</w:t>
+            </w:r>
+          </w:p>
+        </w:tc>
+      </w:tr>
+      <w:tr>
+        <w:tc>
+          <w:tcPr>
+            <w:tcW w:w="1900" w:type="dxa"/>
+            <w:vAlign w:val="top"/>
+            <w:tcMar>
+              <w:top w:w="80" w:type="dxa"/>
+              <w:left w:w="120" w:type="dxa"/>
+              <w:bottom w:w="80" w:type="dxa"/>
+              <w:right w:w="120" w:type="dxa"/>
+            </w:tcMar>
+          </w:tcPr>
+          <w:p>
+            <w:pPr>
+              <w:pStyle w:val="TableText"/>
+            </w:pPr>
+            <w:r>
+              <w:t xml:space="preserve">Accounting</w:t>
+            </w:r>
+          </w:p>
+        </w:tc>
+        <w:tc>
+          <w:tcPr>
+            <w:tcW w:w="7460" w:type="dxa"/>
+            <w:vAlign w:val="top"/>
+            <w:tcMar>
+              <w:top w:w="80" w:type="dxa"/>
+              <w:left w:w="120" w:type="dxa"/>
+              <w:bottom w:w="80" w:type="dxa"/>
+              <w:right w:w="120" w:type="dxa"/>
+            </w:tcMar>
+          </w:tcPr>
+          <w:p>
+            <w:pPr>
+              <w:pStyle w:val="TableText"/>
+            </w:pPr>
+            <w:r>
+              <w:t xml:space="preserve">Customer payments are cash inflow. Salary payments and BusinessExpense records are cash outflow. Staff deposits reconcile collections and are not counted twice.</w:t>
+            </w:r>
+          </w:p>
+        </w:tc>
+      </w:tr>
+      <w:tr>
+        <w:tc>
+          <w:tcPr>
+            <w:tcW w:w="1900" w:type="dxa"/>
+            <w:vAlign w:val="top"/>
+            <w:tcMar>
+              <w:top w:w="80" w:type="dxa"/>
+              <w:left w:w="120" w:type="dxa"/>
+              <w:bottom w:w="80" w:type="dxa"/>
+              <w:right w:w="120" w:type="dxa"/>
+            </w:tcMar>
+          </w:tcPr>
+          <w:p>
+            <w:pPr>
+              <w:pStyle w:val="TableText"/>
+            </w:pPr>
+            <w:r>
+              <w:t xml:space="preserve">Analytics</w:t>
+            </w:r>
+          </w:p>
+        </w:tc>
+        <w:tc>
+          <w:tcPr>
+            <w:tcW w:w="7460" w:type="dxa"/>
+            <w:vAlign w:val="top"/>
+            <w:tcMar>
+              <w:top w:w="80" w:type="dxa"/>
+              <w:left w:w="120" w:type="dxa"/>
+              <w:bottom w:w="80" w:type="dxa"/>
+              <w:right w:w="120" w:type="dxa"/>
+            </w:tcMar>
+          </w:tcPr>
+          <w:p>
+            <w:pPr>
+              <w:pStyle w:val="TableText"/>
+            </w:pPr>
+            <w:r>
+              <w:t xml:space="preserve">Current month revenue, payroll paid and outstanding, expenses, net cash, headcount, pending leave, review average and all-time cash position.</w:t>
+            </w:r>
+          </w:p>
+        </w:tc>
+      </w:tr>
+    </w:tbl>
+    <w:p>
+      <w:pPr>
+        <w:pStyle w:val="Tiny"/>
+      </w:pPr>
+      <w:r>
+        <w:t xml:space="preserve"/>
+      </w:r>
+    </w:p>
+    <w:p>
+      <w:pPr>
+        <w:pStyle w:val="Normal"/>
+      </w:pPr>
+      <w:r>
+        <w:t xml:space="preserve">Apply migration 20260909183000_integrated_business_management before deploying the page. The version 1 application backup and restore workflow does not yet contain leave, performance review or business expense tables. Retain database-level backups and do not rely on an older application backup to recover these records until a versioned restore upgrade is released.</w:t>
       </w:r>
     </w:p>
     <w:p>

</xml_diff>